<commit_message>
Corrige nome do cliente (1a maiuscula) e numero de pagina colado na borda
- app.py: normaliza `cliente` para iniciar maiusculo ("shopee" -> "Shopee")
- template: as 2 secoes finais (corpo, "pagina 5 em diante") tinham margem
  L/R zero e herdavam o rodape da secao anterior, entao o numero de pagina
  (alinhado a direita) colava na borda da folha. Novo footer4.xml com recuo
  direito de 1134 twips deixa o numero na mesma distancia da borda que nas
  demais paginas. Nao mexe nas margens (evita deslocar formas ancoradas).
- rodape_paginacao_fix.py: aplica a correcao no .docx (idempotente); tambem
  chamado no fim do build_template.py.

Verificado via LibreOffice: antes o numero ficava a -0.2pt da borda nas
paginas 5+; depois fica a 56.5pt (igual as paginas 3-4).

Co-Authored-By: Claude Sonnet 5 <noreply@anthropic.com>
</commit_message>
<xml_diff>
--- a/templates/template_proposta.docx
+++ b/templates/template_proposta.docx
@@ -6243,6 +6243,7 @@
           <w:szCs w:val="24"/>
         </w:rPr>
         <w:sectPr>
+          <w:footerReference w:type="default" r:id="rId100"/>
           <w:pgSz w:w="11910" w:h="16850"/>
           <w:pgMar w:top="1940" w:right="0" w:bottom="280" w:left="0" w:header="360" w:footer="360" w:gutter="0"/>
           <w:cols w:space="720"/>
@@ -7115,6 +7116,7 @@
       </w:r>
     </w:p>
     <w:sectPr>
+      <w:footerReference w:type="default" r:id="rId100"/>
       <w:pgSz w:w="11910" w:h="16850"/>
       <w:pgMar w:top="1940" w:right="0" w:bottom="0" w:left="0" w:header="360" w:footer="360" w:gutter="0"/>
       <w:cols w:space="720"/>
@@ -7212,6 +7214,38 @@
       </w:p>
     </w:sdtContent>
   </w:sdt>
+  <w:p>
+    <w:pPr>
+      <w:pStyle w:val="Rodap"/>
+    </w:pPr>
+  </w:p>
+</w:ftr>
+</file>
+
+<file path=word/footer4.xml><?xml version="1.0" encoding="utf-8"?>
+<w:ftr xmlns:w="http://schemas.openxmlformats.org/wordprocessingml/2006/main" xmlns:r="http://schemas.openxmlformats.org/officeDocument/2006/relationships" xmlns:w14="http://schemas.microsoft.com/office/word/2010/wordml">
+  <w:p>
+    <w:pPr>
+      <w:pStyle w:val="Rodap"/>
+      <w:ind w:right="1134"/>
+      <w:jc w:val="right"/>
+    </w:pPr>
+    <w:r>
+      <w:fldChar w:fldCharType="begin"/>
+    </w:r>
+    <w:r>
+      <w:instrText>PAGE   \* MERGEFORMAT</w:instrText>
+    </w:r>
+    <w:r>
+      <w:fldChar w:fldCharType="separate"/>
+    </w:r>
+    <w:r>
+      <w:t>2</w:t>
+    </w:r>
+    <w:r>
+      <w:fldChar w:fldCharType="end"/>
+    </w:r>
+  </w:p>
   <w:p>
     <w:pPr>
       <w:pStyle w:val="Rodap"/>

</xml_diff>